<commit_message>
feat(inbox/aan): Book 11 Vulnerability Management briefing deck + figure write-back
22-slide spec-compliant deck (Date Code 2026-07-08 13:21 ET): three failure
points (enumeration/prioritization/evidence), scanner-follows-inventory
architecture, what assessors check, BOD 22-01 + KEV catalog, the KEV
intersection reordering priority, six-tier SLA table, MDVM on the Arc AMA
channel + coverage matrix, daily KEV pipeline 4-step build (pull/query/
prioritize/emit), WUfB rings + KEV expedite, patch-currency CA enforcement,
SQL CU patching, the daily compliance record (RA-5/SI-2 KSI), retention +
90-day trend, NIST closure + RA-5-on-CM-8 closure necessity, compliance
clock. Write-back adds vuln-fig-05/06/07 (KEV intersection, SQL CU, compliance
record) to the qmd; docx re-rendered (7 figures). Zip kit refreshed to
2026-07-08_1322ET (34 entries, 12 pptx).

Co-Authored-By: Claude Fable 5 <noreply@anthropic.com>
</commit_message>
<xml_diff>
--- a/inbox/Application Aware Networking/Book_11_FedAAN_Vulnerability_Management.docx
+++ b/inbox/Application Aware Networking/Book_11_FedAAN_Vulnerability_Management.docx
@@ -31,7 +31,7 @@
         <w:pStyle w:val="Date"/>
       </w:pPr>
       <w:r>
-        <w:t xml:space="preserve">2026-07-02</w:t>
+        <w:t xml:space="preserve">Invalid Date</w:t>
       </w:r>
     </w:p>
     <w:sdt>
@@ -114,7 +114,7 @@
                     <a:graphicData uri="http://schemas.openxmlformats.org/drawingml/2006/picture">
                       <pic:pic>
                         <pic:nvPicPr>
-                          <pic:cNvPr descr="/opt/quarto/share/formats/docx/warning.png" id="11" name="Picture"/>
+                          <pic:cNvPr descr="C:\Program Files\Quarto\share\formats\docx\warning.png" id="11" name="Picture"/>
                           <pic:cNvPicPr>
                             <a:picLocks noChangeArrowheads="1" noChangeAspect="1"/>
                           </pic:cNvPicPr>
@@ -174,7 +174,7 @@
               <w:pStyle w:val="BodyText"/>
             </w:pPr>
             <w:pPr>
-              <w:spacing w:before="16" w:after="16"/>
+              <w:spacing w:before="16"/>
             </w:pPr>
             <w:r>
               <w:t xml:space="preserve">This document is a</w:t>
@@ -207,6 +207,27 @@
             </w:r>
             <w:r>
               <w:t xml:space="preserve">. It is an attempt at a comprehensive SSA-wide technical roadmap and has not been reviewed or approved by the SSA CIO Office, the Office of Information Security (OIS), or organizational leadership. All recommendations, vendor selections, control mappings, and implementation timelines are subject to revision pending formal review by the SSA CIO Office and organizational components.</w:t>
+            </w:r>
+          </w:p>
+          <w:p>
+            <w:pPr>
+              <w:pStyle w:val="BodyText"/>
+            </w:pPr>
+            <w:pPr>
+              <w:spacing w:after="16"/>
+            </w:pPr>
+            <w:r>
+              <w:rPr>
+                <w:b/>
+                <w:bCs/>
+              </w:rPr>
+              <w:t xml:space="preserve">Date Code:</w:t>
+            </w:r>
+            <w:r>
+              <w:t xml:space="preserve"> </w:t>
+            </w:r>
+            <w:r>
+              <w:t xml:space="preserve">2026-07-08 13:21 ET</w:t>
             </w:r>
           </w:p>
           <w:p/>
@@ -267,7 +288,7 @@
                     <a:graphicData uri="http://schemas.openxmlformats.org/drawingml/2006/picture">
                       <pic:pic>
                         <pic:nvPicPr>
-                          <pic:cNvPr descr="/opt/quarto/share/formats/docx/important.png" id="14" name="Picture"/>
+                          <pic:cNvPr descr="C:\Program Files\Quarto\share\formats\docx\important.png" id="14" name="Picture"/>
                           <pic:cNvPicPr>
                             <a:picLocks noChangeArrowheads="1" noChangeAspect="1"/>
                           </pic:cNvPicPr>
@@ -443,7 +464,7 @@
       </w:r>
     </w:p>
     <w:bookmarkEnd w:id="18"/>
-    <w:bookmarkStart w:id="24" w:name="the-patch-sla-gap"/>
+    <w:bookmarkStart w:id="28" w:name="the-patch-sla-gap"/>
     <w:p>
       <w:pPr>
         <w:pStyle w:val="Heading1"/>
@@ -498,7 +519,7 @@
       </w:r>
     </w:p>
     <w:bookmarkEnd w:id="19"/>
-    <w:bookmarkStart w:id="20" w:name="cisa-bod-22-01-and-the-kev-catalog"/>
+    <w:bookmarkStart w:id="24" w:name="cisa-bod-22-01-and-the-kev-catalog"/>
     <w:p>
       <w:pPr>
         <w:pStyle w:val="Heading2"/>
@@ -584,8 +605,87 @@
         <w:t xml:space="preserve">The consequence for FedRAMP is significant. CVSS 9.0 (Critical) without KEV status carries a 15-day SLA under the standard federal framework. But a CVSS 7.5 (High) that appears in the KEV catalog carries a 14-day SLA for internet-facing systems. The KEV intersection changes the priority ordering entirely. Agencies that prioritize solely by CVSS will systematically under-prioritize exploited vulnerabilities.</w:t>
       </w:r>
     </w:p>
-    <w:bookmarkEnd w:id="20"/>
-    <w:bookmarkStart w:id="23" w:name="patch-sla-table"/>
+    <w:tbl>
+      <w:tblPr>
+        <w:tblStyle w:val="Table"/>
+        <w:tblW w:type="pct" w:w="5000"/>
+        <w:tblLayout w:type="fixed"/>
+        <w:tblLook w:firstRow="0" w:lastRow="0" w:firstColumn="0" w:lastColumn="0" w:noHBand="0" w:noVBand="0" w:val="0000"/>
+      </w:tblPr>
+      <w:tblGrid>
+        <w:gridCol w:w="7920"/>
+      </w:tblGrid>
+      <w:tr>
+        <w:tc>
+          <w:tcPr/>
+          <w:bookmarkStart w:id="23" w:name="fig-vuln05"/>
+          <w:p>
+            <w:pPr>
+              <w:pStyle w:val="Compact"/>
+              <w:jc w:val="center"/>
+            </w:pPr>
+            <w:r>
+              <w:drawing>
+                <wp:inline>
+                  <wp:extent cx="5334000" cy="3000375"/>
+                  <wp:effectExtent b="0" l="0" r="0" t="0"/>
+                  <wp:docPr descr="" title="" id="21" name="Picture"/>
+                  <a:graphic>
+                    <a:graphicData uri="http://schemas.openxmlformats.org/drawingml/2006/picture">
+                      <pic:pic>
+                        <pic:nvPicPr>
+                          <pic:cNvPr descr="figs/vuln-fig-05-kev-intersection.png" id="22" name="Picture"/>
+                          <pic:cNvPicPr>
+                            <a:picLocks noChangeArrowheads="1" noChangeAspect="1"/>
+                          </pic:cNvPicPr>
+                        </pic:nvPicPr>
+                        <pic:blipFill>
+                          <a:blip r:embed="rId20"/>
+                          <a:stretch>
+                            <a:fillRect/>
+                          </a:stretch>
+                        </pic:blipFill>
+                        <pic:spPr bwMode="auto">
+                          <a:xfrm>
+                            <a:off x="0" y="0"/>
+                            <a:ext cx="5334000" cy="3000375"/>
+                          </a:xfrm>
+                          <a:prstGeom prst="rect">
+                            <a:avLst/>
+                          </a:prstGeom>
+                          <a:noFill/>
+                          <a:ln w="9525">
+                            <a:noFill/>
+                            <a:headEnd/>
+                            <a:tailEnd/>
+                          </a:ln>
+                        </pic:spPr>
+                      </pic:pic>
+                    </a:graphicData>
+                  </a:graphic>
+                </wp:inline>
+              </w:drawing>
+            </w:r>
+          </w:p>
+          <w:p>
+            <w:pPr>
+              <w:jc w:val="center"/>
+            </w:pPr>
+            <w:pPr>
+              <w:jc w:val="left"/>
+              <w:spacing w:before="200"/>
+              <w:pStyle w:val="ImageCaption"/>
+            </w:pPr>
+            <w:r>
+              <w:t xml:space="preserve">Figure 1: KEV reorders priority: exploited beats high-CVSS</w:t>
+            </w:r>
+          </w:p>
+          <w:bookmarkEnd w:id="23"/>
+        </w:tc>
+      </w:tr>
+    </w:tbl>
+    <w:bookmarkEnd w:id="24"/>
+    <w:bookmarkStart w:id="27" w:name="patch-sla-table"/>
     <w:p>
       <w:pPr>
         <w:pStyle w:val="Heading2"/>
@@ -999,12 +1099,12 @@
                 <wp:inline>
                   <wp:extent cx="152400" cy="152400"/>
                   <wp:effectExtent b="0" l="0" r="0" t="0"/>
-                  <wp:docPr descr="" title="" id="21" name="Picture"/>
+                  <wp:docPr descr="" title="" id="25" name="Picture"/>
                   <a:graphic>
                     <a:graphicData uri="http://schemas.openxmlformats.org/drawingml/2006/picture">
                       <pic:pic>
                         <pic:nvPicPr>
-                          <pic:cNvPr descr="/opt/quarto/share/formats/docx/warning.png" id="22" name="Picture"/>
+                          <pic:cNvPr descr="C:\Program Files\Quarto\share\formats\docx\warning.png" id="26" name="Picture"/>
                           <pic:cNvPicPr>
                             <a:picLocks noChangeArrowheads="1" noChangeAspect="1"/>
                           </pic:cNvPicPr>
@@ -1091,9 +1191,9 @@
         </w:pict>
       </w:r>
     </w:p>
-    <w:bookmarkEnd w:id="23"/>
-    <w:bookmarkEnd w:id="24"/>
-    <w:bookmarkStart w:id="33" w:name="X2b442fc05acc20b7ed6470dfff2832445fc2597"/>
+    <w:bookmarkEnd w:id="27"/>
+    <w:bookmarkEnd w:id="28"/>
+    <w:bookmarkStart w:id="37" w:name="X2b442fc05acc20b7ed6470dfff2832445fc2597"/>
     <w:p>
       <w:pPr>
         <w:pStyle w:val="Heading1"/>
@@ -1102,7 +1202,7 @@
         <w:t xml:space="preserve">3. Defender for Endpoint and Arc Integration</w:t>
       </w:r>
     </w:p>
-    <w:bookmarkStart w:id="25" w:name="how-mdvm-uses-the-arc-agent-channel"/>
+    <w:bookmarkStart w:id="29" w:name="how-mdvm-uses-the-arc-agent-channel"/>
     <w:p>
       <w:pPr>
         <w:pStyle w:val="Heading2"/>
@@ -1223,8 +1323,8 @@
         <w:t xml:space="preserve">The result is that Arc enrollment is the single gate that enables vulnerability management. An agent added to the Arc inventory is automatically scanned. An agent removed from Arc enrollment is automatically removed from the scan scope. The inventory and the scan scope are always in sync because they are the same list.</w:t>
       </w:r>
     </w:p>
-    <w:bookmarkEnd w:id="25"/>
-    <w:bookmarkStart w:id="29" w:name="coverage-matrix"/>
+    <w:bookmarkEnd w:id="29"/>
+    <w:bookmarkStart w:id="33" w:name="coverage-matrix"/>
     <w:p>
       <w:pPr>
         <w:pStyle w:val="Heading2"/>
@@ -1657,18 +1757,18 @@
                 <wp:inline>
                   <wp:extent cx="152400" cy="152400"/>
                   <wp:effectExtent b="0" l="0" r="0" t="0"/>
-                  <wp:docPr descr="" title="" id="27" name="Picture"/>
+                  <wp:docPr descr="" title="" id="31" name="Picture"/>
                   <a:graphic>
                     <a:graphicData uri="http://schemas.openxmlformats.org/drawingml/2006/picture">
                       <pic:pic>
                         <pic:nvPicPr>
-                          <pic:cNvPr descr="/opt/quarto/share/formats/docx/note.png" id="28" name="Picture"/>
+                          <pic:cNvPr descr="C:\Program Files\Quarto\share\formats\docx\note.png" id="32" name="Picture"/>
                           <pic:cNvPicPr>
                             <a:picLocks noChangeArrowheads="1" noChangeAspect="1"/>
                           </pic:cNvPicPr>
                         </pic:nvPicPr>
                         <pic:blipFill>
-                          <a:blip r:embed="rId26"/>
+                          <a:blip r:embed="rId30"/>
                           <a:stretch>
                             <a:fillRect/>
                           </a:stretch>
@@ -1742,8 +1842,8 @@
         </w:tc>
       </w:tr>
     </w:tbl>
-    <w:bookmarkEnd w:id="29"/>
-    <w:bookmarkStart w:id="32" w:name="X22de9f0b7e674c060eafe00e9b4458a1f0c421d"/>
+    <w:bookmarkEnd w:id="33"/>
+    <w:bookmarkStart w:id="36" w:name="X22de9f0b7e674c060eafe00e9b4458a1f0c421d"/>
     <w:p>
       <w:pPr>
         <w:pStyle w:val="Heading2"/>
@@ -5532,18 +5632,18 @@
                 <wp:inline>
                   <wp:extent cx="152400" cy="152400"/>
                   <wp:effectExtent b="0" l="0" r="0" t="0"/>
-                  <wp:docPr descr="" title="" id="30" name="Picture"/>
+                  <wp:docPr descr="" title="" id="34" name="Picture"/>
                   <a:graphic>
                     <a:graphicData uri="http://schemas.openxmlformats.org/drawingml/2006/picture">
                       <pic:pic>
                         <pic:nvPicPr>
-                          <pic:cNvPr descr="/opt/quarto/share/formats/docx/note.png" id="31" name="Picture"/>
+                          <pic:cNvPr descr="C:\Program Files\Quarto\share\formats\docx\note.png" id="35" name="Picture"/>
                           <pic:cNvPicPr>
                             <a:picLocks noChangeArrowheads="1" noChangeAspect="1"/>
                           </pic:cNvPicPr>
                         </pic:nvPicPr>
                         <pic:blipFill>
-                          <a:blip r:embed="rId26"/>
+                          <a:blip r:embed="rId30"/>
                           <a:stretch>
                             <a:fillRect/>
                           </a:stretch>
@@ -5624,9 +5724,9 @@
         </w:pict>
       </w:r>
     </w:p>
-    <w:bookmarkEnd w:id="32"/>
-    <w:bookmarkEnd w:id="33"/>
-    <w:bookmarkStart w:id="41" w:name="cisa-kev-integration-and-prioritization"/>
+    <w:bookmarkEnd w:id="36"/>
+    <w:bookmarkEnd w:id="37"/>
+    <w:bookmarkStart w:id="45" w:name="cisa-kev-integration-and-prioritization"/>
     <w:p>
       <w:pPr>
         <w:pStyle w:val="Heading1"/>
@@ -5635,7 +5735,7 @@
         <w:t xml:space="preserve">4. CISA KEV Integration and Prioritization</w:t>
       </w:r>
     </w:p>
-    <w:bookmarkStart w:id="34" w:name="the-kev-catalog-json-feed"/>
+    <w:bookmarkStart w:id="38" w:name="the-kev-catalog-json-feed"/>
     <w:p>
       <w:pPr>
         <w:pStyle w:val="Heading2"/>
@@ -5800,8 +5900,8 @@
         <w:t xml:space="preserve">The catalog currently contains over 1,000 entries and grows by 5–20 entries per week. The daily automation pull should be scheduled to run before the morning patch queue review so that overnight additions are reflected in the day’s priority assignments.</w:t>
       </w:r>
     </w:p>
-    <w:bookmarkEnd w:id="34"/>
-    <w:bookmarkStart w:id="40" w:name="kev-pull-and-cve-cross-reference"/>
+    <w:bookmarkEnd w:id="38"/>
+    <w:bookmarkStart w:id="44" w:name="kev-pull-and-cve-cross-reference"/>
     <w:p>
       <w:pPr>
         <w:pStyle w:val="Heading2"/>
@@ -16023,18 +16123,18 @@
           <wp:inline>
             <wp:extent cx="5334000" cy="2154115"/>
             <wp:effectExtent b="0" l="0" r="0" t="0"/>
-            <wp:docPr descr="CISA KEV to patch queue: daily pull, CVE cross-reference, and SLA-prioritized queue output" title="" id="36" name="Picture"/>
+            <wp:docPr descr="CISA KEV to patch queue: daily pull, CVE cross-reference, and SLA-prioritized queue output" title="" id="40" name="Picture"/>
             <a:graphic>
               <a:graphicData uri="http://schemas.openxmlformats.org/drawingml/2006/picture">
                 <pic:pic>
                   <pic:nvPicPr>
-                    <pic:cNvPr descr="figs/vuln-fig-02-kev-patch-flow.png" id="37" name="Picture"/>
+                    <pic:cNvPr descr="figs/vuln-fig-02-kev-patch-flow.png" id="41" name="Picture"/>
                     <pic:cNvPicPr>
                       <a:picLocks noChangeArrowheads="1" noChangeAspect="1"/>
                     </pic:cNvPicPr>
                   </pic:nvPicPr>
                   <pic:blipFill>
-                    <a:blip r:embed="rId35"/>
+                    <a:blip r:embed="rId39"/>
                     <a:stretch>
                       <a:fillRect/>
                     </a:stretch>
@@ -16110,12 +16210,12 @@
                 <wp:inline>
                   <wp:extent cx="152400" cy="152400"/>
                   <wp:effectExtent b="0" l="0" r="0" t="0"/>
-                  <wp:docPr descr="" title="" id="38" name="Picture"/>
+                  <wp:docPr descr="" title="" id="42" name="Picture"/>
                   <a:graphic>
                     <a:graphicData uri="http://schemas.openxmlformats.org/drawingml/2006/picture">
                       <pic:pic>
                         <pic:nvPicPr>
-                          <pic:cNvPr descr="/opt/quarto/share/formats/docx/important.png" id="39" name="Picture"/>
+                          <pic:cNvPr descr="C:\Program Files\Quarto\share\formats\docx\important.png" id="43" name="Picture"/>
                           <pic:cNvPicPr>
                             <a:picLocks noChangeArrowheads="1" noChangeAspect="1"/>
                           </pic:cNvPicPr>
@@ -16202,9 +16302,9 @@
         </w:pict>
       </w:r>
     </w:p>
-    <w:bookmarkEnd w:id="40"/>
-    <w:bookmarkEnd w:id="41"/>
-    <w:bookmarkStart w:id="52" w:name="intune-patch-automation"/>
+    <w:bookmarkEnd w:id="44"/>
+    <w:bookmarkEnd w:id="45"/>
+    <w:bookmarkStart w:id="56" w:name="intune-patch-automation"/>
     <w:p>
       <w:pPr>
         <w:pStyle w:val="Heading1"/>
@@ -16213,7 +16313,7 @@
         <w:t xml:space="preserve">5. Intune Patch Automation</w:t>
       </w:r>
     </w:p>
-    <w:bookmarkStart w:id="44" w:name="windows-update-for-business-architecture"/>
+    <w:bookmarkStart w:id="48" w:name="windows-update-for-business-architecture"/>
     <w:p>
       <w:pPr>
         <w:pStyle w:val="Heading2"/>
@@ -16279,18 +16379,18 @@
                 <wp:inline>
                   <wp:extent cx="152400" cy="152400"/>
                   <wp:effectExtent b="0" l="0" r="0" t="0"/>
-                  <wp:docPr descr="" title="" id="42" name="Picture"/>
+                  <wp:docPr descr="" title="" id="46" name="Picture"/>
                   <a:graphic>
                     <a:graphicData uri="http://schemas.openxmlformats.org/drawingml/2006/picture">
                       <pic:pic>
                         <pic:nvPicPr>
-                          <pic:cNvPr descr="/opt/quarto/share/formats/docx/note.png" id="43" name="Picture"/>
+                          <pic:cNvPr descr="C:\Program Files\Quarto\share\formats\docx\note.png" id="47" name="Picture"/>
                           <pic:cNvPicPr>
                             <a:picLocks noChangeArrowheads="1" noChangeAspect="1"/>
                           </pic:cNvPicPr>
                         </pic:nvPicPr>
                         <pic:blipFill>
-                          <a:blip r:embed="rId26"/>
+                          <a:blip r:embed="rId30"/>
                           <a:stretch>
                             <a:fillRect/>
                           </a:stretch>
@@ -16364,8 +16464,8 @@
         </w:tc>
       </w:tr>
     </w:tbl>
-    <w:bookmarkEnd w:id="44"/>
-    <w:bookmarkStart w:id="45" w:name="ring-configuration"/>
+    <w:bookmarkEnd w:id="48"/>
+    <w:bookmarkStart w:id="49" w:name="ring-configuration"/>
     <w:p>
       <w:pPr>
         <w:pStyle w:val="Heading2"/>
@@ -19337,8 +19437,8 @@
         <w:t xml:space="preserve">"3. Link compliance policy to Conditional Access for non-compliant block"</w:t>
       </w:r>
     </w:p>
-    <w:bookmarkEnd w:id="45"/>
-    <w:bookmarkStart w:id="51" w:name="X7f916346cf379f6a81c9f941d6f082d3ef49415"/>
+    <w:bookmarkEnd w:id="49"/>
+    <w:bookmarkStart w:id="55" w:name="X7f916346cf379f6a81c9f941d6f082d3ef49415"/>
     <w:p>
       <w:pPr>
         <w:pStyle w:val="Heading2"/>
@@ -20733,12 +20833,12 @@
                 <wp:inline>
                   <wp:extent cx="152400" cy="152400"/>
                   <wp:effectExtent b="0" l="0" r="0" t="0"/>
-                  <wp:docPr descr="" title="" id="46" name="Picture"/>
+                  <wp:docPr descr="" title="" id="50" name="Picture"/>
                   <a:graphic>
                     <a:graphicData uri="http://schemas.openxmlformats.org/drawingml/2006/picture">
                       <pic:pic>
                         <pic:nvPicPr>
-                          <pic:cNvPr descr="/opt/quarto/share/formats/docx/warning.png" id="47" name="Picture"/>
+                          <pic:cNvPr descr="C:\Program Files\Quarto\share\formats\docx\warning.png" id="51" name="Picture"/>
                           <pic:cNvPicPr>
                             <a:picLocks noChangeArrowheads="1" noChangeAspect="1"/>
                           </pic:cNvPicPr>
@@ -20827,18 +20927,18 @@
           <wp:inline>
             <wp:extent cx="5334000" cy="1948961"/>
             <wp:effectExtent b="0" l="0" r="0" t="0"/>
-            <wp:docPr descr="Intune update rings: pilot, broad, and production rings with compliance gate and Conditional Access enforcement" title="" id="49" name="Picture"/>
+            <wp:docPr descr="Intune update rings: pilot, broad, and production rings with compliance gate and Conditional Access enforcement" title="" id="53" name="Picture"/>
             <a:graphic>
               <a:graphicData uri="http://schemas.openxmlformats.org/drawingml/2006/picture">
                 <pic:pic>
                   <pic:nvPicPr>
-                    <pic:cNvPr descr="figs/vuln-fig-03-patch-rings.png" id="50" name="Picture"/>
+                    <pic:cNvPr descr="figs/vuln-fig-03-patch-rings.png" id="54" name="Picture"/>
                     <pic:cNvPicPr>
                       <a:picLocks noChangeArrowheads="1" noChangeAspect="1"/>
                     </pic:cNvPicPr>
                   </pic:nvPicPr>
                   <pic:blipFill>
-                    <a:blip r:embed="rId48"/>
+                    <a:blip r:embed="rId52"/>
                     <a:stretch>
                       <a:fillRect/>
                     </a:stretch>
@@ -20880,9 +20980,9 @@
         </w:pict>
       </w:r>
     </w:p>
-    <w:bookmarkEnd w:id="51"/>
-    <w:bookmarkEnd w:id="52"/>
-    <w:bookmarkStart w:id="58" w:name="sql-server-patching"/>
+    <w:bookmarkEnd w:id="55"/>
+    <w:bookmarkEnd w:id="56"/>
+    <w:bookmarkStart w:id="66" w:name="sql-server-patching"/>
     <w:p>
       <w:pPr>
         <w:pStyle w:val="Heading1"/>
@@ -20891,7 +20991,7 @@
         <w:t xml:space="preserve">6. SQL Server Patching</w:t>
       </w:r>
     </w:p>
-    <w:bookmarkStart w:id="53" w:name="sql-server-cumulative-update-lifecycle"/>
+    <w:bookmarkStart w:id="61" w:name="sql-server-cumulative-update-lifecycle"/>
     <w:p>
       <w:pPr>
         <w:pStyle w:val="Heading2"/>
@@ -20933,8 +21033,87 @@
         <w:t xml:space="preserve">) defines the end-of-support dates for each version. SQL Server 2019 mainstream support ends July 2024 (extended security updates available through 2029 via Arc enrollment). SQL Server 2022 mainstream support runs through January 2028.</w:t>
       </w:r>
     </w:p>
-    <w:bookmarkEnd w:id="53"/>
-    <w:bookmarkStart w:id="54" w:name="X8cf3e6a35923c002d2d8a59aaa7df926465215a"/>
+    <w:tbl>
+      <w:tblPr>
+        <w:tblStyle w:val="Table"/>
+        <w:tblW w:type="pct" w:w="5000"/>
+        <w:tblLayout w:type="fixed"/>
+        <w:tblLook w:firstRow="0" w:lastRow="0" w:firstColumn="0" w:lastColumn="0" w:noHBand="0" w:noVBand="0" w:val="0000"/>
+      </w:tblPr>
+      <w:tblGrid>
+        <w:gridCol w:w="7920"/>
+      </w:tblGrid>
+      <w:tr>
+        <w:tc>
+          <w:tcPr/>
+          <w:bookmarkStart w:id="60" w:name="fig-vuln06"/>
+          <w:p>
+            <w:pPr>
+              <w:pStyle w:val="Compact"/>
+              <w:jc w:val="center"/>
+            </w:pPr>
+            <w:r>
+              <w:drawing>
+                <wp:inline>
+                  <wp:extent cx="5334000" cy="3000375"/>
+                  <wp:effectExtent b="0" l="0" r="0" t="0"/>
+                  <wp:docPr descr="" title="" id="58" name="Picture"/>
+                  <a:graphic>
+                    <a:graphicData uri="http://schemas.openxmlformats.org/drawingml/2006/picture">
+                      <pic:pic>
+                        <pic:nvPicPr>
+                          <pic:cNvPr descr="figs/vuln-fig-06-sql-cu-patching.png" id="59" name="Picture"/>
+                          <pic:cNvPicPr>
+                            <a:picLocks noChangeArrowheads="1" noChangeAspect="1"/>
+                          </pic:cNvPicPr>
+                        </pic:nvPicPr>
+                        <pic:blipFill>
+                          <a:blip r:embed="rId57"/>
+                          <a:stretch>
+                            <a:fillRect/>
+                          </a:stretch>
+                        </pic:blipFill>
+                        <pic:spPr bwMode="auto">
+                          <a:xfrm>
+                            <a:off x="0" y="0"/>
+                            <a:ext cx="5334000" cy="3000375"/>
+                          </a:xfrm>
+                          <a:prstGeom prst="rect">
+                            <a:avLst/>
+                          </a:prstGeom>
+                          <a:noFill/>
+                          <a:ln w="9525">
+                            <a:noFill/>
+                            <a:headEnd/>
+                            <a:tailEnd/>
+                          </a:ln>
+                        </pic:spPr>
+                      </pic:pic>
+                    </a:graphicData>
+                  </a:graphic>
+                </wp:inline>
+              </w:drawing>
+            </w:r>
+          </w:p>
+          <w:p>
+            <w:pPr>
+              <w:jc w:val="center"/>
+            </w:pPr>
+            <w:pPr>
+              <w:jc w:val="left"/>
+              <w:spacing w:before="200"/>
+              <w:pStyle w:val="ImageCaption"/>
+            </w:pPr>
+            <w:r>
+              <w:t xml:space="preserve">Figure 2: SQL Server patching: cumulative updates, GDRs, and end-of-support</w:t>
+            </w:r>
+          </w:p>
+          <w:bookmarkEnd w:id="60"/>
+        </w:tc>
+      </w:tr>
+    </w:tbl>
+    <w:bookmarkEnd w:id="61"/>
+    <w:bookmarkStart w:id="62" w:name="X8cf3e6a35923c002d2d8a59aaa7df926465215a"/>
     <w:p>
       <w:pPr>
         <w:pStyle w:val="Heading2"/>
@@ -26728,8 +26907,8 @@
         <w:t xml:space="preserve">"</w:t>
       </w:r>
     </w:p>
-    <w:bookmarkEnd w:id="54"/>
-    <w:bookmarkStart w:id="57" w:name="Xaf7bf5cd1b945cc0d6afd9115dfed79e4a37875"/>
+    <w:bookmarkEnd w:id="62"/>
+    <w:bookmarkStart w:id="65" w:name="Xaf7bf5cd1b945cc0d6afd9115dfed79e4a37875"/>
     <w:p>
       <w:pPr>
         <w:pStyle w:val="Heading2"/>
@@ -28106,18 +28285,18 @@
                 <wp:inline>
                   <wp:extent cx="152400" cy="152400"/>
                   <wp:effectExtent b="0" l="0" r="0" t="0"/>
-                  <wp:docPr descr="" title="" id="55" name="Picture"/>
+                  <wp:docPr descr="" title="" id="63" name="Picture"/>
                   <a:graphic>
                     <a:graphicData uri="http://schemas.openxmlformats.org/drawingml/2006/picture">
                       <pic:pic>
                         <pic:nvPicPr>
-                          <pic:cNvPr descr="/opt/quarto/share/formats/docx/note.png" id="56" name="Picture"/>
+                          <pic:cNvPr descr="C:\Program Files\Quarto\share\formats\docx\note.png" id="64" name="Picture"/>
                           <pic:cNvPicPr>
                             <a:picLocks noChangeArrowheads="1" noChangeAspect="1"/>
                           </pic:cNvPicPr>
                         </pic:nvPicPr>
                         <pic:blipFill>
-                          <a:blip r:embed="rId26"/>
+                          <a:blip r:embed="rId30"/>
                           <a:stretch>
                             <a:fillRect/>
                           </a:stretch>
@@ -28198,9 +28377,9 @@
         </w:pict>
       </w:r>
     </w:p>
-    <w:bookmarkEnd w:id="57"/>
-    <w:bookmarkEnd w:id="58"/>
-    <w:bookmarkStart w:id="62" w:name="continuous-monitoring-record"/>
+    <w:bookmarkEnd w:id="65"/>
+    <w:bookmarkEnd w:id="66"/>
+    <w:bookmarkStart w:id="74" w:name="continuous-monitoring-record"/>
     <w:p>
       <w:pPr>
         <w:pStyle w:val="Heading1"/>
@@ -28209,7 +28388,7 @@
         <w:t xml:space="preserve">7. Continuous Monitoring Record</w:t>
       </w:r>
     </w:p>
-    <w:bookmarkStart w:id="59" w:name="daily-machine-readable-compliance-output"/>
+    <w:bookmarkStart w:id="71" w:name="daily-machine-readable-compliance-output"/>
     <w:p>
       <w:pPr>
         <w:pStyle w:val="Heading2"/>
@@ -28226,6 +28405,85 @@
         <w:t xml:space="preserve">The daily patch queue script in Section 3 produces two JSON files: a full CVE-machine finding list and a compliance summary. The compliance summary is the primary artifact for FedRAMP 20x KSI reporting. Its structure is designed to answer the specific questions an automated KSI engine asks about RA-5 compliance without human assembly.</w:t>
       </w:r>
     </w:p>
+    <w:tbl>
+      <w:tblPr>
+        <w:tblStyle w:val="Table"/>
+        <w:tblW w:type="pct" w:w="5000"/>
+        <w:tblLayout w:type="fixed"/>
+        <w:tblLook w:firstRow="0" w:lastRow="0" w:firstColumn="0" w:lastColumn="0" w:noHBand="0" w:noVBand="0" w:val="0000"/>
+      </w:tblPr>
+      <w:tblGrid>
+        <w:gridCol w:w="7920"/>
+      </w:tblGrid>
+      <w:tr>
+        <w:tc>
+          <w:tcPr/>
+          <w:bookmarkStart w:id="70" w:name="fig-vuln07"/>
+          <w:p>
+            <w:pPr>
+              <w:pStyle w:val="Compact"/>
+              <w:jc w:val="center"/>
+            </w:pPr>
+            <w:r>
+              <w:drawing>
+                <wp:inline>
+                  <wp:extent cx="5334000" cy="3000375"/>
+                  <wp:effectExtent b="0" l="0" r="0" t="0"/>
+                  <wp:docPr descr="" title="" id="68" name="Picture"/>
+                  <a:graphic>
+                    <a:graphicData uri="http://schemas.openxmlformats.org/drawingml/2006/picture">
+                      <pic:pic>
+                        <pic:nvPicPr>
+                          <pic:cNvPr descr="figs/vuln-fig-07-compliance-record.png" id="69" name="Picture"/>
+                          <pic:cNvPicPr>
+                            <a:picLocks noChangeArrowheads="1" noChangeAspect="1"/>
+                          </pic:cNvPicPr>
+                        </pic:nvPicPr>
+                        <pic:blipFill>
+                          <a:blip r:embed="rId67"/>
+                          <a:stretch>
+                            <a:fillRect/>
+                          </a:stretch>
+                        </pic:blipFill>
+                        <pic:spPr bwMode="auto">
+                          <a:xfrm>
+                            <a:off x="0" y="0"/>
+                            <a:ext cx="5334000" cy="3000375"/>
+                          </a:xfrm>
+                          <a:prstGeom prst="rect">
+                            <a:avLst/>
+                          </a:prstGeom>
+                          <a:noFill/>
+                          <a:ln w="9525">
+                            <a:noFill/>
+                            <a:headEnd/>
+                            <a:tailEnd/>
+                          </a:ln>
+                        </pic:spPr>
+                      </pic:pic>
+                    </a:graphicData>
+                  </a:graphic>
+                </wp:inline>
+              </w:drawing>
+            </w:r>
+          </w:p>
+          <w:p>
+            <w:pPr>
+              <w:jc w:val="center"/>
+            </w:pPr>
+            <w:pPr>
+              <w:jc w:val="left"/>
+              <w:spacing w:before="200"/>
+              <w:pStyle w:val="ImageCaption"/>
+            </w:pPr>
+            <w:r>
+              <w:t xml:space="preserve">Figure 3: The daily compliance record: the RA-5 / SI-2 KSI artifact</w:t>
+            </w:r>
+          </w:p>
+          <w:bookmarkEnd w:id="70"/>
+        </w:tc>
+      </w:tr>
+    </w:tbl>
     <w:p>
       <w:pPr>
         <w:pStyle w:val="BodyText"/>
@@ -28910,8 +29168,8 @@
         <w:t xml:space="preserve">(FedRAMP 20x target is 95% or higher for High/Critical severity across a 30-day rolling window).</w:t>
       </w:r>
     </w:p>
-    <w:bookmarkEnd w:id="59"/>
-    <w:bookmarkStart w:id="60" w:name="Xe241b7a293262119fe84db68b4adf0d84423dc4"/>
+    <w:bookmarkEnd w:id="71"/>
+    <w:bookmarkStart w:id="72" w:name="Xe241b7a293262119fe84db68b4adf0d84423dc4"/>
     <w:p>
       <w:pPr>
         <w:pStyle w:val="Heading2"/>
@@ -31009,8 +31267,8 @@
         <w:t xml:space="preserve">"90-day trend exported to: .\compliance-trend-90day.csv"</w:t>
       </w:r>
     </w:p>
-    <w:bookmarkEnd w:id="60"/>
-    <w:bookmarkStart w:id="61" w:name="azure-monitor-workbook-for-operations"/>
+    <w:bookmarkEnd w:id="72"/>
+    <w:bookmarkStart w:id="73" w:name="azure-monitor-workbook-for-operations"/>
     <w:p>
       <w:pPr>
         <w:pStyle w:val="Heading2"/>
@@ -32803,9 +33061,9 @@
         </w:pict>
       </w:r>
     </w:p>
-    <w:bookmarkEnd w:id="61"/>
-    <w:bookmarkEnd w:id="62"/>
-    <w:bookmarkStart w:id="67" w:name="nist-control-closure-table"/>
+    <w:bookmarkEnd w:id="73"/>
+    <w:bookmarkEnd w:id="74"/>
+    <w:bookmarkStart w:id="79" w:name="nist-control-closure-table"/>
     <w:p>
       <w:pPr>
         <w:pStyle w:val="Heading1"/>
@@ -32842,7 +33100,7 @@
       <w:r>
         <w:t xml:space="preserve"> </w:t>
       </w:r>
-      <w:hyperlink r:id="rId63">
+      <w:hyperlink r:id="rId75">
         <w:r>
           <w:rPr>
             <w:rStyle w:val="Hyperlink"/>
@@ -33403,18 +33661,18 @@
           <wp:inline>
             <wp:extent cx="5334000" cy="2560320"/>
             <wp:effectExtent b="0" l="0" r="0" t="0"/>
-            <wp:docPr descr="NIST control closure for Part 11 Vulnerability Management showing eight controls from RA-5 through CM-7(1) with before/after state and authority citations" title="" id="65" name="Picture"/>
+            <wp:docPr descr="NIST control closure for Part 11 Vulnerability Management showing eight controls from RA-5 through CM-7(1) with before/after state and authority citations" title="" id="77" name="Picture"/>
             <a:graphic>
               <a:graphicData uri="http://schemas.openxmlformats.org/drawingml/2006/picture">
                 <pic:pic>
                   <pic:nvPicPr>
-                    <pic:cNvPr descr="figs/vuln-fig-04-nist-closure.png" id="66" name="Picture"/>
+                    <pic:cNvPr descr="figs/vuln-fig-04-nist-closure.png" id="78" name="Picture"/>
                     <pic:cNvPicPr>
                       <a:picLocks noChangeArrowheads="1" noChangeAspect="1"/>
                     </pic:cNvPicPr>
                   </pic:nvPicPr>
                   <pic:blipFill>
-                    <a:blip r:embed="rId64"/>
+                    <a:blip r:embed="rId76"/>
                     <a:stretch>
                       <a:fillRect/>
                     </a:stretch>
@@ -33456,8 +33714,8 @@
         </w:pict>
       </w:r>
     </w:p>
-    <w:bookmarkEnd w:id="67"/>
-    <w:bookmarkStart w:id="70" w:name="fedramp-20x-ksi-alignment"/>
+    <w:bookmarkEnd w:id="79"/>
+    <w:bookmarkStart w:id="82" w:name="fedramp-20x-ksi-alignment"/>
     <w:p>
       <w:pPr>
         <w:pStyle w:val="Heading1"/>
@@ -33507,12 +33765,12 @@
                 <wp:inline>
                   <wp:extent cx="152400" cy="152400"/>
                   <wp:effectExtent b="0" l="0" r="0" t="0"/>
-                  <wp:docPr descr="" title="" id="68" name="Picture"/>
+                  <wp:docPr descr="" title="" id="80" name="Picture"/>
                   <a:graphic>
                     <a:graphicData uri="http://schemas.openxmlformats.org/drawingml/2006/picture">
                       <pic:pic>
                         <pic:nvPicPr>
-                          <pic:cNvPr descr="/opt/quarto/share/formats/docx/important.png" id="69" name="Picture"/>
+                          <pic:cNvPr descr="C:\Program Files\Quarto\share\formats\docx\important.png" id="81" name="Picture"/>
                           <pic:cNvPicPr>
                             <a:picLocks noChangeArrowheads="1" noChangeAspect="1"/>
                           </pic:cNvPicPr>
@@ -33806,7 +34064,7 @@
         </w:tc>
       </w:tr>
     </w:tbl>
-    <w:bookmarkEnd w:id="70"/>
+    <w:bookmarkEnd w:id="82"/>
     <w:sectPr>
       <w:footnotePr>
         <w:numRestart w:val="eachSect"/>

</xml_diff>